<commit_message>
Evrak sablonlari: ogrenci adlari form tablolarina satir satir yazilir ({OGRENCI1..30})
</commit_message>
<xml_diff>
--- a/evrak/olcme/gozlem-formu.docx
+++ b/evrak/olcme/gozlem-formu.docx
@@ -281,19 +281,6 @@
     </w:tbl>
     <w:p>
       <w:pPr>
-        <w:spacing w:after="40"/>
-        <w:jc w:val="left"/>
-      </w:pPr>
-      <w:r>
-        <w:rPr>
-          <w:b w:val="0"/>
-          <w:sz w:val="18"/>
-        </w:rPr>
-        <w:t>Sınıf listesi: {OGRENCILER}</w:t>
-      </w:r>
-    </w:p>
-    <w:p>
-      <w:pPr>
         <w:spacing w:after="80"/>
         <w:jc w:val="left"/>
       </w:pPr>
@@ -547,6 +534,7 @@
               <w:rPr>
                 <w:sz w:val="20"/>
               </w:rPr>
+              <w:t>{OGRENCI1}</w:t>
             </w:r>
           </w:p>
         </w:tc>
@@ -628,6 +616,7 @@
               <w:rPr>
                 <w:sz w:val="20"/>
               </w:rPr>
+              <w:t>{OGRENCI2}</w:t>
             </w:r>
           </w:p>
         </w:tc>
@@ -709,6 +698,7 @@
               <w:rPr>
                 <w:sz w:val="20"/>
               </w:rPr>
+              <w:t>{OGRENCI3}</w:t>
             </w:r>
           </w:p>
         </w:tc>
@@ -790,6 +780,7 @@
               <w:rPr>
                 <w:sz w:val="20"/>
               </w:rPr>
+              <w:t>{OGRENCI4}</w:t>
             </w:r>
           </w:p>
         </w:tc>
@@ -871,6 +862,7 @@
               <w:rPr>
                 <w:sz w:val="20"/>
               </w:rPr>
+              <w:t>{OGRENCI5}</w:t>
             </w:r>
           </w:p>
         </w:tc>
@@ -952,6 +944,7 @@
               <w:rPr>
                 <w:sz w:val="20"/>
               </w:rPr>
+              <w:t>{OGRENCI6}</w:t>
             </w:r>
           </w:p>
         </w:tc>
@@ -1033,6 +1026,7 @@
               <w:rPr>
                 <w:sz w:val="20"/>
               </w:rPr>
+              <w:t>{OGRENCI7}</w:t>
             </w:r>
           </w:p>
         </w:tc>
@@ -1114,6 +1108,7 @@
               <w:rPr>
                 <w:sz w:val="20"/>
               </w:rPr>
+              <w:t>{OGRENCI8}</w:t>
             </w:r>
           </w:p>
         </w:tc>
@@ -1195,6 +1190,7 @@
               <w:rPr>
                 <w:sz w:val="20"/>
               </w:rPr>
+              <w:t>{OGRENCI9}</w:t>
             </w:r>
           </w:p>
         </w:tc>
@@ -1276,6 +1272,7 @@
               <w:rPr>
                 <w:sz w:val="20"/>
               </w:rPr>
+              <w:t>{OGRENCI10}</w:t>
             </w:r>
           </w:p>
         </w:tc>
@@ -1357,6 +1354,7 @@
               <w:rPr>
                 <w:sz w:val="20"/>
               </w:rPr>
+              <w:t>{OGRENCI11}</w:t>
             </w:r>
           </w:p>
         </w:tc>
@@ -1438,6 +1436,7 @@
               <w:rPr>
                 <w:sz w:val="20"/>
               </w:rPr>
+              <w:t>{OGRENCI12}</w:t>
             </w:r>
           </w:p>
         </w:tc>
@@ -1519,6 +1518,7 @@
               <w:rPr>
                 <w:sz w:val="20"/>
               </w:rPr>
+              <w:t>{OGRENCI13}</w:t>
             </w:r>
           </w:p>
         </w:tc>
@@ -1600,6 +1600,7 @@
               <w:rPr>
                 <w:sz w:val="20"/>
               </w:rPr>
+              <w:t>{OGRENCI14}</w:t>
             </w:r>
           </w:p>
         </w:tc>
@@ -1681,6 +1682,827 @@
               <w:rPr>
                 <w:sz w:val="20"/>
               </w:rPr>
+              <w:t>{OGRENCI15}</w:t>
+            </w:r>
+          </w:p>
+        </w:tc>
+        <w:tc>
+          <w:tcPr>
+            <w:tcW w:type="dxa" w:w="1247"/>
+          </w:tcPr>
+          <w:p>
+            <w:r/>
+            <w:r>
+              <w:rPr>
+                <w:sz w:val="20"/>
+              </w:rPr>
+            </w:r>
+          </w:p>
+        </w:tc>
+        <w:tc>
+          <w:tcPr>
+            <w:tcW w:type="dxa" w:w="1247"/>
+          </w:tcPr>
+          <w:p>
+            <w:r/>
+            <w:r>
+              <w:rPr>
+                <w:sz w:val="20"/>
+              </w:rPr>
+            </w:r>
+          </w:p>
+        </w:tc>
+        <w:tc>
+          <w:tcPr>
+            <w:tcW w:type="dxa" w:w="1247"/>
+          </w:tcPr>
+          <w:p>
+            <w:r/>
+            <w:r>
+              <w:rPr>
+                <w:sz w:val="20"/>
+              </w:rPr>
+            </w:r>
+          </w:p>
+        </w:tc>
+        <w:tc>
+          <w:tcPr>
+            <w:tcW w:type="dxa" w:w="3175"/>
+          </w:tcPr>
+          <w:p>
+            <w:r/>
+            <w:r>
+              <w:rPr>
+                <w:sz w:val="20"/>
+              </w:rPr>
+            </w:r>
+          </w:p>
+        </w:tc>
+      </w:tr>
+      <w:tr>
+        <w:tc>
+          <w:tcPr>
+            <w:tcW w:type="dxa" w:w="794"/>
+          </w:tcPr>
+          <w:p>
+            <w:r/>
+            <w:r>
+              <w:rPr>
+                <w:sz w:val="20"/>
+              </w:rPr>
+              <w:t>16</w:t>
+            </w:r>
+          </w:p>
+        </w:tc>
+        <w:tc>
+          <w:tcPr>
+            <w:tcW w:type="dxa" w:w="2835"/>
+          </w:tcPr>
+          <w:p>
+            <w:r/>
+            <w:r>
+              <w:rPr>
+                <w:sz w:val="20"/>
+              </w:rPr>
+              <w:t>{OGRENCI16}</w:t>
+            </w:r>
+          </w:p>
+        </w:tc>
+        <w:tc>
+          <w:tcPr>
+            <w:tcW w:type="dxa" w:w="1247"/>
+          </w:tcPr>
+          <w:p>
+            <w:r/>
+            <w:r>
+              <w:rPr>
+                <w:sz w:val="20"/>
+              </w:rPr>
+            </w:r>
+          </w:p>
+        </w:tc>
+        <w:tc>
+          <w:tcPr>
+            <w:tcW w:type="dxa" w:w="1247"/>
+          </w:tcPr>
+          <w:p>
+            <w:r/>
+            <w:r>
+              <w:rPr>
+                <w:sz w:val="20"/>
+              </w:rPr>
+            </w:r>
+          </w:p>
+        </w:tc>
+        <w:tc>
+          <w:tcPr>
+            <w:tcW w:type="dxa" w:w="1247"/>
+          </w:tcPr>
+          <w:p>
+            <w:r/>
+            <w:r>
+              <w:rPr>
+                <w:sz w:val="20"/>
+              </w:rPr>
+            </w:r>
+          </w:p>
+        </w:tc>
+        <w:tc>
+          <w:tcPr>
+            <w:tcW w:type="dxa" w:w="3175"/>
+          </w:tcPr>
+          <w:p>
+            <w:r/>
+            <w:r>
+              <w:rPr>
+                <w:sz w:val="20"/>
+              </w:rPr>
+            </w:r>
+          </w:p>
+        </w:tc>
+      </w:tr>
+      <w:tr>
+        <w:tc>
+          <w:tcPr>
+            <w:tcW w:type="dxa" w:w="794"/>
+          </w:tcPr>
+          <w:p>
+            <w:r/>
+            <w:r>
+              <w:rPr>
+                <w:sz w:val="20"/>
+              </w:rPr>
+              <w:t>17</w:t>
+            </w:r>
+          </w:p>
+        </w:tc>
+        <w:tc>
+          <w:tcPr>
+            <w:tcW w:type="dxa" w:w="2835"/>
+          </w:tcPr>
+          <w:p>
+            <w:r/>
+            <w:r>
+              <w:rPr>
+                <w:sz w:val="20"/>
+              </w:rPr>
+              <w:t>{OGRENCI17}</w:t>
+            </w:r>
+          </w:p>
+        </w:tc>
+        <w:tc>
+          <w:tcPr>
+            <w:tcW w:type="dxa" w:w="1247"/>
+          </w:tcPr>
+          <w:p>
+            <w:r/>
+            <w:r>
+              <w:rPr>
+                <w:sz w:val="20"/>
+              </w:rPr>
+            </w:r>
+          </w:p>
+        </w:tc>
+        <w:tc>
+          <w:tcPr>
+            <w:tcW w:type="dxa" w:w="1247"/>
+          </w:tcPr>
+          <w:p>
+            <w:r/>
+            <w:r>
+              <w:rPr>
+                <w:sz w:val="20"/>
+              </w:rPr>
+            </w:r>
+          </w:p>
+        </w:tc>
+        <w:tc>
+          <w:tcPr>
+            <w:tcW w:type="dxa" w:w="1247"/>
+          </w:tcPr>
+          <w:p>
+            <w:r/>
+            <w:r>
+              <w:rPr>
+                <w:sz w:val="20"/>
+              </w:rPr>
+            </w:r>
+          </w:p>
+        </w:tc>
+        <w:tc>
+          <w:tcPr>
+            <w:tcW w:type="dxa" w:w="3175"/>
+          </w:tcPr>
+          <w:p>
+            <w:r/>
+            <w:r>
+              <w:rPr>
+                <w:sz w:val="20"/>
+              </w:rPr>
+            </w:r>
+          </w:p>
+        </w:tc>
+      </w:tr>
+      <w:tr>
+        <w:tc>
+          <w:tcPr>
+            <w:tcW w:type="dxa" w:w="794"/>
+          </w:tcPr>
+          <w:p>
+            <w:r/>
+            <w:r>
+              <w:rPr>
+                <w:sz w:val="20"/>
+              </w:rPr>
+              <w:t>18</w:t>
+            </w:r>
+          </w:p>
+        </w:tc>
+        <w:tc>
+          <w:tcPr>
+            <w:tcW w:type="dxa" w:w="2835"/>
+          </w:tcPr>
+          <w:p>
+            <w:r/>
+            <w:r>
+              <w:rPr>
+                <w:sz w:val="20"/>
+              </w:rPr>
+              <w:t>{OGRENCI18}</w:t>
+            </w:r>
+          </w:p>
+        </w:tc>
+        <w:tc>
+          <w:tcPr>
+            <w:tcW w:type="dxa" w:w="1247"/>
+          </w:tcPr>
+          <w:p>
+            <w:r/>
+            <w:r>
+              <w:rPr>
+                <w:sz w:val="20"/>
+              </w:rPr>
+            </w:r>
+          </w:p>
+        </w:tc>
+        <w:tc>
+          <w:tcPr>
+            <w:tcW w:type="dxa" w:w="1247"/>
+          </w:tcPr>
+          <w:p>
+            <w:r/>
+            <w:r>
+              <w:rPr>
+                <w:sz w:val="20"/>
+              </w:rPr>
+            </w:r>
+          </w:p>
+        </w:tc>
+        <w:tc>
+          <w:tcPr>
+            <w:tcW w:type="dxa" w:w="1247"/>
+          </w:tcPr>
+          <w:p>
+            <w:r/>
+            <w:r>
+              <w:rPr>
+                <w:sz w:val="20"/>
+              </w:rPr>
+            </w:r>
+          </w:p>
+        </w:tc>
+        <w:tc>
+          <w:tcPr>
+            <w:tcW w:type="dxa" w:w="3175"/>
+          </w:tcPr>
+          <w:p>
+            <w:r/>
+            <w:r>
+              <w:rPr>
+                <w:sz w:val="20"/>
+              </w:rPr>
+            </w:r>
+          </w:p>
+        </w:tc>
+      </w:tr>
+      <w:tr>
+        <w:tc>
+          <w:tcPr>
+            <w:tcW w:type="dxa" w:w="794"/>
+          </w:tcPr>
+          <w:p>
+            <w:r/>
+            <w:r>
+              <w:rPr>
+                <w:sz w:val="20"/>
+              </w:rPr>
+              <w:t>19</w:t>
+            </w:r>
+          </w:p>
+        </w:tc>
+        <w:tc>
+          <w:tcPr>
+            <w:tcW w:type="dxa" w:w="2835"/>
+          </w:tcPr>
+          <w:p>
+            <w:r/>
+            <w:r>
+              <w:rPr>
+                <w:sz w:val="20"/>
+              </w:rPr>
+              <w:t>{OGRENCI19}</w:t>
+            </w:r>
+          </w:p>
+        </w:tc>
+        <w:tc>
+          <w:tcPr>
+            <w:tcW w:type="dxa" w:w="1247"/>
+          </w:tcPr>
+          <w:p>
+            <w:r/>
+            <w:r>
+              <w:rPr>
+                <w:sz w:val="20"/>
+              </w:rPr>
+            </w:r>
+          </w:p>
+        </w:tc>
+        <w:tc>
+          <w:tcPr>
+            <w:tcW w:type="dxa" w:w="1247"/>
+          </w:tcPr>
+          <w:p>
+            <w:r/>
+            <w:r>
+              <w:rPr>
+                <w:sz w:val="20"/>
+              </w:rPr>
+            </w:r>
+          </w:p>
+        </w:tc>
+        <w:tc>
+          <w:tcPr>
+            <w:tcW w:type="dxa" w:w="1247"/>
+          </w:tcPr>
+          <w:p>
+            <w:r/>
+            <w:r>
+              <w:rPr>
+                <w:sz w:val="20"/>
+              </w:rPr>
+            </w:r>
+          </w:p>
+        </w:tc>
+        <w:tc>
+          <w:tcPr>
+            <w:tcW w:type="dxa" w:w="3175"/>
+          </w:tcPr>
+          <w:p>
+            <w:r/>
+            <w:r>
+              <w:rPr>
+                <w:sz w:val="20"/>
+              </w:rPr>
+            </w:r>
+          </w:p>
+        </w:tc>
+      </w:tr>
+      <w:tr>
+        <w:tc>
+          <w:tcPr>
+            <w:tcW w:type="dxa" w:w="794"/>
+          </w:tcPr>
+          <w:p>
+            <w:r/>
+            <w:r>
+              <w:rPr>
+                <w:sz w:val="20"/>
+              </w:rPr>
+              <w:t>20</w:t>
+            </w:r>
+          </w:p>
+        </w:tc>
+        <w:tc>
+          <w:tcPr>
+            <w:tcW w:type="dxa" w:w="2835"/>
+          </w:tcPr>
+          <w:p>
+            <w:r/>
+            <w:r>
+              <w:rPr>
+                <w:sz w:val="20"/>
+              </w:rPr>
+              <w:t>{OGRENCI20}</w:t>
+            </w:r>
+          </w:p>
+        </w:tc>
+        <w:tc>
+          <w:tcPr>
+            <w:tcW w:type="dxa" w:w="1247"/>
+          </w:tcPr>
+          <w:p>
+            <w:r/>
+            <w:r>
+              <w:rPr>
+                <w:sz w:val="20"/>
+              </w:rPr>
+            </w:r>
+          </w:p>
+        </w:tc>
+        <w:tc>
+          <w:tcPr>
+            <w:tcW w:type="dxa" w:w="1247"/>
+          </w:tcPr>
+          <w:p>
+            <w:r/>
+            <w:r>
+              <w:rPr>
+                <w:sz w:val="20"/>
+              </w:rPr>
+            </w:r>
+          </w:p>
+        </w:tc>
+        <w:tc>
+          <w:tcPr>
+            <w:tcW w:type="dxa" w:w="1247"/>
+          </w:tcPr>
+          <w:p>
+            <w:r/>
+            <w:r>
+              <w:rPr>
+                <w:sz w:val="20"/>
+              </w:rPr>
+            </w:r>
+          </w:p>
+        </w:tc>
+        <w:tc>
+          <w:tcPr>
+            <w:tcW w:type="dxa" w:w="3175"/>
+          </w:tcPr>
+          <w:p>
+            <w:r/>
+            <w:r>
+              <w:rPr>
+                <w:sz w:val="20"/>
+              </w:rPr>
+            </w:r>
+          </w:p>
+        </w:tc>
+      </w:tr>
+      <w:tr>
+        <w:tc>
+          <w:tcPr>
+            <w:tcW w:type="dxa" w:w="794"/>
+          </w:tcPr>
+          <w:p>
+            <w:r/>
+            <w:r>
+              <w:rPr>
+                <w:sz w:val="20"/>
+              </w:rPr>
+              <w:t>21</w:t>
+            </w:r>
+          </w:p>
+        </w:tc>
+        <w:tc>
+          <w:tcPr>
+            <w:tcW w:type="dxa" w:w="2835"/>
+          </w:tcPr>
+          <w:p>
+            <w:r/>
+            <w:r>
+              <w:rPr>
+                <w:sz w:val="20"/>
+              </w:rPr>
+              <w:t>{OGRENCI21}</w:t>
+            </w:r>
+          </w:p>
+        </w:tc>
+        <w:tc>
+          <w:tcPr>
+            <w:tcW w:type="dxa" w:w="1247"/>
+          </w:tcPr>
+          <w:p>
+            <w:r/>
+            <w:r>
+              <w:rPr>
+                <w:sz w:val="20"/>
+              </w:rPr>
+            </w:r>
+          </w:p>
+        </w:tc>
+        <w:tc>
+          <w:tcPr>
+            <w:tcW w:type="dxa" w:w="1247"/>
+          </w:tcPr>
+          <w:p>
+            <w:r/>
+            <w:r>
+              <w:rPr>
+                <w:sz w:val="20"/>
+              </w:rPr>
+            </w:r>
+          </w:p>
+        </w:tc>
+        <w:tc>
+          <w:tcPr>
+            <w:tcW w:type="dxa" w:w="1247"/>
+          </w:tcPr>
+          <w:p>
+            <w:r/>
+            <w:r>
+              <w:rPr>
+                <w:sz w:val="20"/>
+              </w:rPr>
+            </w:r>
+          </w:p>
+        </w:tc>
+        <w:tc>
+          <w:tcPr>
+            <w:tcW w:type="dxa" w:w="3175"/>
+          </w:tcPr>
+          <w:p>
+            <w:r/>
+            <w:r>
+              <w:rPr>
+                <w:sz w:val="20"/>
+              </w:rPr>
+            </w:r>
+          </w:p>
+        </w:tc>
+      </w:tr>
+      <w:tr>
+        <w:tc>
+          <w:tcPr>
+            <w:tcW w:type="dxa" w:w="794"/>
+          </w:tcPr>
+          <w:p>
+            <w:r/>
+            <w:r>
+              <w:rPr>
+                <w:sz w:val="20"/>
+              </w:rPr>
+              <w:t>22</w:t>
+            </w:r>
+          </w:p>
+        </w:tc>
+        <w:tc>
+          <w:tcPr>
+            <w:tcW w:type="dxa" w:w="2835"/>
+          </w:tcPr>
+          <w:p>
+            <w:r/>
+            <w:r>
+              <w:rPr>
+                <w:sz w:val="20"/>
+              </w:rPr>
+              <w:t>{OGRENCI22}</w:t>
+            </w:r>
+          </w:p>
+        </w:tc>
+        <w:tc>
+          <w:tcPr>
+            <w:tcW w:type="dxa" w:w="1247"/>
+          </w:tcPr>
+          <w:p>
+            <w:r/>
+            <w:r>
+              <w:rPr>
+                <w:sz w:val="20"/>
+              </w:rPr>
+            </w:r>
+          </w:p>
+        </w:tc>
+        <w:tc>
+          <w:tcPr>
+            <w:tcW w:type="dxa" w:w="1247"/>
+          </w:tcPr>
+          <w:p>
+            <w:r/>
+            <w:r>
+              <w:rPr>
+                <w:sz w:val="20"/>
+              </w:rPr>
+            </w:r>
+          </w:p>
+        </w:tc>
+        <w:tc>
+          <w:tcPr>
+            <w:tcW w:type="dxa" w:w="1247"/>
+          </w:tcPr>
+          <w:p>
+            <w:r/>
+            <w:r>
+              <w:rPr>
+                <w:sz w:val="20"/>
+              </w:rPr>
+            </w:r>
+          </w:p>
+        </w:tc>
+        <w:tc>
+          <w:tcPr>
+            <w:tcW w:type="dxa" w:w="3175"/>
+          </w:tcPr>
+          <w:p>
+            <w:r/>
+            <w:r>
+              <w:rPr>
+                <w:sz w:val="20"/>
+              </w:rPr>
+            </w:r>
+          </w:p>
+        </w:tc>
+      </w:tr>
+      <w:tr>
+        <w:tc>
+          <w:tcPr>
+            <w:tcW w:type="dxa" w:w="794"/>
+          </w:tcPr>
+          <w:p>
+            <w:r/>
+            <w:r>
+              <w:rPr>
+                <w:sz w:val="20"/>
+              </w:rPr>
+              <w:t>23</w:t>
+            </w:r>
+          </w:p>
+        </w:tc>
+        <w:tc>
+          <w:tcPr>
+            <w:tcW w:type="dxa" w:w="2835"/>
+          </w:tcPr>
+          <w:p>
+            <w:r/>
+            <w:r>
+              <w:rPr>
+                <w:sz w:val="20"/>
+              </w:rPr>
+              <w:t>{OGRENCI23}</w:t>
+            </w:r>
+          </w:p>
+        </w:tc>
+        <w:tc>
+          <w:tcPr>
+            <w:tcW w:type="dxa" w:w="1247"/>
+          </w:tcPr>
+          <w:p>
+            <w:r/>
+            <w:r>
+              <w:rPr>
+                <w:sz w:val="20"/>
+              </w:rPr>
+            </w:r>
+          </w:p>
+        </w:tc>
+        <w:tc>
+          <w:tcPr>
+            <w:tcW w:type="dxa" w:w="1247"/>
+          </w:tcPr>
+          <w:p>
+            <w:r/>
+            <w:r>
+              <w:rPr>
+                <w:sz w:val="20"/>
+              </w:rPr>
+            </w:r>
+          </w:p>
+        </w:tc>
+        <w:tc>
+          <w:tcPr>
+            <w:tcW w:type="dxa" w:w="1247"/>
+          </w:tcPr>
+          <w:p>
+            <w:r/>
+            <w:r>
+              <w:rPr>
+                <w:sz w:val="20"/>
+              </w:rPr>
+            </w:r>
+          </w:p>
+        </w:tc>
+        <w:tc>
+          <w:tcPr>
+            <w:tcW w:type="dxa" w:w="3175"/>
+          </w:tcPr>
+          <w:p>
+            <w:r/>
+            <w:r>
+              <w:rPr>
+                <w:sz w:val="20"/>
+              </w:rPr>
+            </w:r>
+          </w:p>
+        </w:tc>
+      </w:tr>
+      <w:tr>
+        <w:tc>
+          <w:tcPr>
+            <w:tcW w:type="dxa" w:w="794"/>
+          </w:tcPr>
+          <w:p>
+            <w:r/>
+            <w:r>
+              <w:rPr>
+                <w:sz w:val="20"/>
+              </w:rPr>
+              <w:t>24</w:t>
+            </w:r>
+          </w:p>
+        </w:tc>
+        <w:tc>
+          <w:tcPr>
+            <w:tcW w:type="dxa" w:w="2835"/>
+          </w:tcPr>
+          <w:p>
+            <w:r/>
+            <w:r>
+              <w:rPr>
+                <w:sz w:val="20"/>
+              </w:rPr>
+              <w:t>{OGRENCI24}</w:t>
+            </w:r>
+          </w:p>
+        </w:tc>
+        <w:tc>
+          <w:tcPr>
+            <w:tcW w:type="dxa" w:w="1247"/>
+          </w:tcPr>
+          <w:p>
+            <w:r/>
+            <w:r>
+              <w:rPr>
+                <w:sz w:val="20"/>
+              </w:rPr>
+            </w:r>
+          </w:p>
+        </w:tc>
+        <w:tc>
+          <w:tcPr>
+            <w:tcW w:type="dxa" w:w="1247"/>
+          </w:tcPr>
+          <w:p>
+            <w:r/>
+            <w:r>
+              <w:rPr>
+                <w:sz w:val="20"/>
+              </w:rPr>
+            </w:r>
+          </w:p>
+        </w:tc>
+        <w:tc>
+          <w:tcPr>
+            <w:tcW w:type="dxa" w:w="1247"/>
+          </w:tcPr>
+          <w:p>
+            <w:r/>
+            <w:r>
+              <w:rPr>
+                <w:sz w:val="20"/>
+              </w:rPr>
+            </w:r>
+          </w:p>
+        </w:tc>
+        <w:tc>
+          <w:tcPr>
+            <w:tcW w:type="dxa" w:w="3175"/>
+          </w:tcPr>
+          <w:p>
+            <w:r/>
+            <w:r>
+              <w:rPr>
+                <w:sz w:val="20"/>
+              </w:rPr>
+            </w:r>
+          </w:p>
+        </w:tc>
+      </w:tr>
+      <w:tr>
+        <w:tc>
+          <w:tcPr>
+            <w:tcW w:type="dxa" w:w="794"/>
+          </w:tcPr>
+          <w:p>
+            <w:r/>
+            <w:r>
+              <w:rPr>
+                <w:sz w:val="20"/>
+              </w:rPr>
+              <w:t>25</w:t>
+            </w:r>
+          </w:p>
+        </w:tc>
+        <w:tc>
+          <w:tcPr>
+            <w:tcW w:type="dxa" w:w="2835"/>
+          </w:tcPr>
+          <w:p>
+            <w:r/>
+            <w:r>
+              <w:rPr>
+                <w:sz w:val="20"/>
+              </w:rPr>
+              <w:t>{OGRENCI25}</w:t>
             </w:r>
           </w:p>
         </w:tc>

</xml_diff>